<commit_message>
Pequenas correções na atividade escrita.
</commit_message>
<xml_diff>
--- a/c++/Atividade Avaliativa Teste de Qualidade/Atividade 1/Atividade Escrita Teste de qualidade.docx
+++ b/c++/Atividade Avaliativa Teste de Qualidade/Atividade 1/Atividade Escrita Teste de qualidade.docx
@@ -216,12 +216,6 @@
       </w:r>
     </w:p>
     <w:p>
-      <w:pPr>
-        <w:rPr>
-          <w:b/>
-          <w:bCs/>
-        </w:rPr>
-      </w:pPr>
       <w:r>
         <w:rPr>
           <w:b/>
@@ -236,17 +230,34 @@
         </w:rPr>
         <w:t xml:space="preserve"> Tdd e bdd</w:t>
       </w:r>
-    </w:p>
-    <w:p/>
-    <w:p>
-      <w:r>
-        <w:t>Eu não entendi muito bem o que deveria apresentar na atividade,</w:t>
-      </w:r>
-      <w:r>
-        <w:t xml:space="preserve"> pois o slide acabou passando informações muito vagas,</w:t>
-      </w:r>
-      <w:r>
-        <w:t xml:space="preserve"> mas vamos lá, irei dissertar.</w:t>
+      <w:r>
+        <w:t xml:space="preserve">. </w:t>
+      </w:r>
+      <w:r>
+        <w:rPr>
+          <w:rFonts w:ascii="Segoe UI Emoji" w:hAnsi="Segoe UI Emoji" w:cs="Segoe UI Emoji"/>
+          <w:b/>
+          <w:bCs/>
+        </w:rPr>
+        <w:t>✅</w:t>
+      </w:r>
+    </w:p>
+    <w:p/>
+    <w:p>
+      <w:r>
+        <w:t xml:space="preserve">Eu não entendi muito bem o que deveria </w:t>
+      </w:r>
+      <w:r>
+        <w:t>ser apresentado nessa atividade</w:t>
+      </w:r>
+      <w:r>
+        <w:t>,</w:t>
+      </w:r>
+      <w:r>
+        <w:t xml:space="preserve"> pois o slide acabou passando informações muito vagas</w:t>
+      </w:r>
+      <w:r>
+        <w:t>, então, tentarei entregar a minha interpretação dos slides.</w:t>
       </w:r>
     </w:p>
     <w:p/>
@@ -266,18 +277,8 @@
           <w:sz w:val="28"/>
           <w:szCs w:val="28"/>
         </w:rPr>
-        <w:t>Introdução ( ou será que divagação?)</w:t>
-      </w:r>
-    </w:p>
-    <w:p>
-      <w:pPr>
-        <w:rPr>
-          <w:b/>
-          <w:bCs/>
-          <w:sz w:val="28"/>
-          <w:szCs w:val="28"/>
-        </w:rPr>
-      </w:pPr>
+        <w:t>Anexo os links do GitHub contendo as atividades:</w:t>
+      </w:r>
     </w:p>
     <w:p>
       <w:hyperlink r:id="rId4" w:history="1">
@@ -312,81 +313,91 @@
       </w:hyperlink>
     </w:p>
     <w:p/>
-    <w:p/>
-    <w:p>
-      <w:r>
-        <w:t xml:space="preserve">Publiquei no github </w:t>
-      </w:r>
-      <w:r>
-        <w:t xml:space="preserve">as atividades de C++, tanto a versão que eu entreguei para a professora Cláudia, como a versão refatorada </w:t>
-      </w:r>
-      <w:r>
-        <w:t>da aula de teste de qualidade.</w:t>
-      </w:r>
-      <w:r>
-        <w:t xml:space="preserve"> </w:t>
-      </w:r>
-      <w:r>
-        <w:t>Também deixei disponíveis</w:t>
-      </w:r>
-      <w:r>
-        <w:t xml:space="preserve"> as versões</w:t>
-      </w:r>
-      <w:r>
-        <w:t xml:space="preserve"> anteriores e</w:t>
-      </w:r>
-      <w:r>
-        <w:t xml:space="preserve"> incompletas</w:t>
-      </w:r>
-      <w:r>
-        <w:t>,</w:t>
-      </w:r>
-      <w:r>
-        <w:t xml:space="preserve"> as quais eu mantive para registrar as etapas do desenvolvimento da atividade</w:t>
-      </w:r>
-      <w:r>
-        <w:t xml:space="preserve"> e o meu método de prototipagem</w:t>
-      </w:r>
-      <w:r>
-        <w:t>.</w:t>
-      </w:r>
-    </w:p>
-    <w:p/>
-    <w:p>
-      <w:r>
-        <w:t>Elas não foram ordenadas, então não sei dizer qual arquivo é referente à qual versão do código, porém ali tem vários arquivos diferentes referentes à várias etapas de desenvolvimento da atividade.</w:t>
-      </w:r>
-    </w:p>
-    <w:p/>
-    <w:p/>
-    <w:p>
-      <w:pPr>
+    <w:p>
+      <w:r>
         <w:rPr>
           <w:b/>
           <w:bCs/>
           <w:sz w:val="28"/>
           <w:szCs w:val="28"/>
         </w:rPr>
-      </w:pPr>
-      <w:r>
+        <w:t>Introdução</w:t>
+      </w:r>
+    </w:p>
+    <w:p/>
+    <w:p>
+      <w:r>
+        <w:t xml:space="preserve">Publiquei no github </w:t>
+      </w:r>
+      <w:r>
+        <w:t xml:space="preserve">as atividades de C++, tanto a versão que eu entreguei para a professora Cláudia, como a versão refatorada </w:t>
+      </w:r>
+      <w:r>
+        <w:t>da aula de teste de qualidade.</w:t>
+      </w:r>
+      <w:r>
+        <w:t xml:space="preserve"> </w:t>
+      </w:r>
+      <w:r>
+        <w:t>Também deixei disponíveis</w:t>
+      </w:r>
+      <w:r>
+        <w:t xml:space="preserve"> as versões</w:t>
+      </w:r>
+      <w:r>
+        <w:t xml:space="preserve"> anteriores e</w:t>
+      </w:r>
+      <w:r>
+        <w:t xml:space="preserve"> incompletas</w:t>
+      </w:r>
+      <w:r>
+        <w:t>,</w:t>
+      </w:r>
+      <w:r>
+        <w:t xml:space="preserve"> as quais eu mantive para registrar as etapas do desenvolvimento da atividade</w:t>
+      </w:r>
+      <w:r>
+        <w:t xml:space="preserve"> e o meu método de prototipagem</w:t>
+      </w:r>
+      <w:r>
+        <w:t>.</w:t>
+      </w:r>
+    </w:p>
+    <w:p/>
+    <w:p>
+      <w:r>
+        <w:t>Elas não foram ordenadas, então não sei dizer qual arquivo é referente à qual versão do código, porém ali tem vários arquivos diferentes referentes à várias etapas de desenvolvimento da atividade.</w:t>
+      </w:r>
+    </w:p>
+    <w:p/>
+    <w:p/>
+    <w:p>
+      <w:pPr>
         <w:rPr>
           <w:b/>
           <w:bCs/>
           <w:sz w:val="28"/>
           <w:szCs w:val="28"/>
         </w:rPr>
-        <w:lastRenderedPageBreak/>
-        <w:t>Desenvolvimento</w:t>
-      </w:r>
-    </w:p>
-    <w:p>
-      <w:pPr>
+      </w:pPr>
+      <w:r>
         <w:rPr>
           <w:b/>
           <w:bCs/>
           <w:sz w:val="28"/>
           <w:szCs w:val="28"/>
         </w:rPr>
+        <w:t>Desenvolvimento</w:t>
+      </w:r>
+    </w:p>
+    <w:p>
+      <w:pPr>
+        <w:rPr>
+          <w:b/>
+          <w:bCs/>
+          <w:sz w:val="28"/>
+          <w:szCs w:val="28"/>
+        </w:rPr>
       </w:pPr>
     </w:p>
     <w:p>
@@ -400,7 +411,13 @@
         <w:t xml:space="preserve"> adequado as normas do CLEAN CODE,</w:t>
       </w:r>
       <w:r>
-        <w:t xml:space="preserve"> mesmo a versão que eu já tinha </w:t>
+        <w:t xml:space="preserve"> mesmo a versão que eu já </w:t>
+      </w:r>
+      <w:r>
+        <w:t>havia</w:t>
+      </w:r>
+      <w:r>
+        <w:t xml:space="preserve"> </w:t>
       </w:r>
       <w:r>
         <w:t>entregado</w:t>
@@ -424,6 +441,9 @@
         <w:t xml:space="preserve"> será que é sidos? Agora eu não sei) apresentadas durante as aulas, apesar de já ter conhecimento prévio sobre elas, imaginei que seria trapaça ou que invalidaria a atividade</w:t>
       </w:r>
       <w:r>
+        <w:t xml:space="preserve"> apresentar mais do que foi ensinado durante as aulas</w:t>
+      </w:r>
+      <w:r>
         <w:t xml:space="preserve"> e por conta disso, não utilizei tais práticas</w:t>
       </w:r>
       <w:r>
@@ -487,213 +507,214 @@
         <w:t xml:space="preserve"> sobre o método SOLID</w:t>
       </w:r>
       <w:r>
-        <w:t xml:space="preserve"> e </w:t>
-      </w:r>
-      <w:r>
-        <w:t>aí</w:t>
-      </w:r>
-      <w:r>
-        <w:t xml:space="preserve"> eu fiquei muito indignado pois </w:t>
-      </w:r>
-      <w:r>
-        <w:t>teria de</w:t>
-      </w:r>
-      <w:r>
         <w:t xml:space="preserve"> </w:t>
       </w:r>
       <w:r>
-        <w:t>refazer</w:t>
-      </w:r>
-      <w:r>
-        <w:t xml:space="preserve"> a atividade de C++ </w:t>
-      </w:r>
-      <w:r>
-        <w:t xml:space="preserve">com </w:t>
-      </w:r>
-      <w:r>
-        <w:t>os conhecimentos adquirido na sexta</w:t>
-      </w:r>
-      <w:r>
-        <w:t xml:space="preserve"> numa atividade que deveria ser entregue segunda e que já estava pronta</w:t>
+        <w:t>o que acabou me trazendo certa decepção, pois acabei de adquirir um conhecimento importante que poderia ser utilizado para fazer uma atividade que já estava pronta, e somente o fato de imaginar ter de refazer tudo me causou repulsa.</w:t>
+      </w:r>
+      <w:r>
+        <w:t xml:space="preserve"> </w:t>
+      </w:r>
+    </w:p>
+    <w:p/>
+    <w:p>
+      <w:r>
+        <w:t>Dito isso, decidi ignorar este novo conhecimento e não o agreguei em minha atividade por conta do aborrecimento causado. Somados ao fato da falta de tempo, decidi não refazer e entreguei assim mesmo.</w:t>
+      </w:r>
+    </w:p>
+    <w:p/>
+    <w:p>
+      <w:r>
+        <w:t xml:space="preserve">O que acabou sendo bom. Visto que na segunda feira tivemos a aula introdutória sobre programação orientada à objetos e agora sim eu tinha duas melhorias para </w:t>
+      </w:r>
+      <w:r>
+        <w:lastRenderedPageBreak/>
+        <w:t>fazer na minha atividade, o que acabou melhorando a minha situação, pois agora tinha motivos o suficiente para “corrigir” a atividade.</w:t>
+      </w:r>
+    </w:p>
+    <w:p/>
+    <w:p>
+      <w:r>
+        <w:t xml:space="preserve"> </w:t>
+      </w:r>
+      <w:r>
+        <w:t>C</w:t>
+      </w:r>
+      <w:r>
+        <w:t xml:space="preserve">oloquei corrigir entre aspas pelo motivo de que os “erros” </w:t>
+      </w:r>
+      <w:r>
+        <w:t>existem somente porque eu não queria utilizar recursos ainda não aprendidos em sala.</w:t>
+      </w:r>
+    </w:p>
+    <w:p/>
+    <w:p/>
+    <w:p>
+      <w:r>
+        <w:t>Em vista do exposto</w:t>
+      </w:r>
+      <w:r>
+        <w:t xml:space="preserve">, hoje, na terça </w:t>
+      </w:r>
+      <w:r>
+        <w:t>feira (</w:t>
+      </w:r>
+      <w:r>
+        <w:t>quarta p</w:t>
+      </w:r>
+      <w:r>
+        <w:t>or</w:t>
+      </w:r>
+      <w:r>
+        <w:t>q</w:t>
+      </w:r>
+      <w:r>
+        <w:t>ue</w:t>
+      </w:r>
+      <w:r>
+        <w:t xml:space="preserve"> atualmente é 00;50), com o conhecimento dos métodos SOLID e também com o conhecimento da programação orientada a objetos </w:t>
+      </w:r>
+      <w:r>
+        <w:t>termino esta atividade</w:t>
       </w:r>
       <w:r>
         <w:t>.</w:t>
       </w:r>
     </w:p>
     <w:p/>
-    <w:p>
-      <w:r>
-        <w:t xml:space="preserve">Contudo como </w:t>
-      </w:r>
-      <w:r>
-        <w:t>não tive tempo então</w:t>
+    <w:p/>
+    <w:p>
+      <w:r>
+        <w:t>C</w:t>
+      </w:r>
+      <w:r>
+        <w:t xml:space="preserve">ertamente </w:t>
+      </w:r>
+      <w:r>
+        <w:t>esta atividade foi feita com auxílio de inteligência artificial</w:t>
+      </w:r>
+      <w:r>
+        <w:t xml:space="preserve">, pois </w:t>
+      </w:r>
+      <w:r>
+        <w:t xml:space="preserve">de outra maneira </w:t>
+      </w:r>
+      <w:r>
+        <w:t xml:space="preserve">demoraria tempo demais, mas eu prometo que todas as linhas de código foram </w:t>
+      </w:r>
+      <w:r>
+        <w:t>feitas</w:t>
+      </w:r>
+      <w:r>
+        <w:t xml:space="preserve"> </w:t>
+      </w:r>
+      <w:r>
+        <w:t>à</w:t>
+      </w:r>
+      <w:r>
+        <w:t xml:space="preserve"> mão</w:t>
+      </w:r>
+      <w:r>
+        <w:t>.</w:t>
+      </w:r>
+      <w:r>
+        <w:t xml:space="preserve"> </w:t>
+      </w:r>
+      <w:r>
+        <w:t>O</w:t>
+      </w:r>
+      <w:r>
+        <w:t xml:space="preserve"> que</w:t>
       </w:r>
       <w:r>
         <w:t xml:space="preserve"> eu</w:t>
       </w:r>
       <w:r>
-        <w:t xml:space="preserve"> não fiz.</w:t>
+        <w:t xml:space="preserve"> considerei </w:t>
+      </w:r>
+      <w:r>
+        <w:t xml:space="preserve">ser </w:t>
+      </w:r>
+      <w:r>
+        <w:t>o suficiente para absorver</w:t>
       </w:r>
       <w:r>
         <w:t xml:space="preserve"> </w:t>
       </w:r>
-    </w:p>
-    <w:p/>
-    <w:p>
-      <w:r>
-        <w:t>O que acabou sendo bom. Visto que na segunda feira tivemos a aula introdutória sobre programação orientada à objetos e agora sim eu tinha duas melhorias para fazer na minha atividade, o que acabou melhorando a minha situação, pois agora tinha motivos o suficiente para “corrigir” a atividade.</w:t>
+      <w:r>
+        <w:t>boa parte</w:t>
+      </w:r>
+      <w:r>
+        <w:t xml:space="preserve"> do conhecimento</w:t>
+      </w:r>
+      <w:r>
+        <w:t xml:space="preserve"> e da lógica da programação</w:t>
+      </w:r>
+      <w:r>
+        <w:t xml:space="preserve"> nela contida.</w:t>
+      </w:r>
+    </w:p>
+    <w:p/>
+    <w:p>
+      <w:r>
+        <w:t>Mesmo sem saber eu utilizei metodologias ágeis de testes visto que, durante o desenvolvimento da atividade mantive os arquivos moderadamente organizados, com várias versões disponíveis e fiz os testes manualmente rodando o programa sempre que alguma implementação era adicionada e polindo funções sempre que ficava fora do meu agrado.</w:t>
+      </w:r>
+      <w:r>
+        <w:br/>
+      </w:r>
+      <w:r>
+        <w:br/>
+        <w:t xml:space="preserve">A minha metodologia de teste é simples porém eficaz, a cada linha de código eu aperto “Run” para ver se vai dar erro e no próprio terminal eu testo a funcionalidade para ver se ficou boa. </w:t>
+      </w:r>
+      <w:r>
+        <w:br/>
+      </w:r>
+      <w:r>
+        <w:br/>
+        <w:t>Admito que nesta versão refatorada eu ainda não tive tempo</w:t>
+      </w:r>
+      <w:r>
+        <w:t>(nem energia, também não tive vontade)</w:t>
+      </w:r>
+      <w:r>
+        <w:t xml:space="preserve"> de fazer testes, porém na versão entregue da atividade de C++( sem a programação orientada a objetos e sem os métodos SOLID) eu fiz seguindo a metodologia de a cada linha adicionada testar para ver se ficou boa.</w:t>
+      </w:r>
+      <w:r>
+        <w:br/>
+      </w:r>
+      <w:r>
+        <w:br/>
+        <w:t xml:space="preserve">Talvez foi pura sorte ou talvez as aulas referente as metodologias ágeis( as quais eu esqueci completamente) ficaram gravadas em meu subconsciente e as usei mesmo sem saber que as estava utilizando, porém é isso. Finalmente acabou! </w:t>
       </w:r>
     </w:p>
     <w:p/>
     <w:p>
       <w:r>
         <w:lastRenderedPageBreak/>
-        <w:t xml:space="preserve"> </w:t>
-      </w:r>
-      <w:r>
-        <w:t>C</w:t>
-      </w:r>
-      <w:r>
-        <w:t xml:space="preserve">oloquei corrigir entre aspas pelo motivo de que os “erros” </w:t>
-      </w:r>
-      <w:r>
-        <w:t>existem somente porque eu não queria utilizar recursos ainda não aprendidos em sala.</w:t>
-      </w:r>
-    </w:p>
-    <w:p/>
-    <w:p/>
-    <w:p>
-      <w:r>
-        <w:t>Em vista do exposto</w:t>
-      </w:r>
-      <w:r>
-        <w:t xml:space="preserve">, hoje, na terça </w:t>
-      </w:r>
-      <w:r>
-        <w:t>feira (</w:t>
-      </w:r>
-      <w:r>
-        <w:t>quarta p</w:t>
-      </w:r>
-      <w:r>
-        <w:t>or</w:t>
-      </w:r>
-      <w:r>
-        <w:t>q</w:t>
-      </w:r>
-      <w:r>
-        <w:t>ue</w:t>
-      </w:r>
-      <w:r>
-        <w:t xml:space="preserve"> atualmente é 00;50), com o conhecimento dos métodos SOLID e também com o conhecimento da programação orientada a objetos </w:t>
-      </w:r>
-      <w:r>
-        <w:t>termino esta atividade</w:t>
-      </w:r>
-      <w:r>
-        <w:t>.</w:t>
-      </w:r>
-    </w:p>
-    <w:p/>
-    <w:p/>
-    <w:p>
-      <w:r>
-        <w:t>C</w:t>
-      </w:r>
-      <w:r>
-        <w:t xml:space="preserve">ertamente </w:t>
-      </w:r>
-      <w:r>
-        <w:t>esta atividade foi feita com auxílio de inteligência artificial</w:t>
-      </w:r>
-      <w:r>
-        <w:t xml:space="preserve">, pois </w:t>
-      </w:r>
-      <w:r>
-        <w:t xml:space="preserve">de outra maneira </w:t>
-      </w:r>
-      <w:r>
-        <w:t xml:space="preserve">demoraria tempo demais, mas eu prometo que todas as linhas de código foram </w:t>
-      </w:r>
-      <w:r>
-        <w:t>feitas</w:t>
-      </w:r>
-      <w:r>
-        <w:t xml:space="preserve"> </w:t>
-      </w:r>
-      <w:r>
-        <w:t>à</w:t>
-      </w:r>
-      <w:r>
-        <w:t xml:space="preserve"> mão</w:t>
-      </w:r>
-      <w:r>
-        <w:t>.</w:t>
-      </w:r>
-      <w:r>
-        <w:t xml:space="preserve"> </w:t>
-      </w:r>
-      <w:r>
-        <w:t>O</w:t>
-      </w:r>
-      <w:r>
-        <w:t xml:space="preserve"> que</w:t>
-      </w:r>
-      <w:r>
-        <w:t xml:space="preserve"> eu</w:t>
-      </w:r>
-      <w:r>
-        <w:t xml:space="preserve"> considerei </w:t>
-      </w:r>
-      <w:r>
-        <w:t xml:space="preserve">ser </w:t>
-      </w:r>
-      <w:r>
-        <w:t>o suficiente para absorver</w:t>
-      </w:r>
-      <w:r>
-        <w:t xml:space="preserve"> </w:t>
-      </w:r>
-      <w:r>
-        <w:t>boa parte</w:t>
-      </w:r>
-      <w:r>
-        <w:t xml:space="preserve"> do conhecimento</w:t>
-      </w:r>
-      <w:r>
-        <w:t xml:space="preserve"> e da lógica da programação</w:t>
-      </w:r>
-      <w:r>
-        <w:t xml:space="preserve"> nela contida.</w:t>
-      </w:r>
-    </w:p>
-    <w:p/>
-    <w:p>
-      <w:r>
-        <w:t>Isso tudo somado ao fato de ter eu ter feito esta atividade à mão duas vezes seguidas, já estou considerando a possibilidade de deixar o SENAC e me matricular em HARVARD</w:t>
-      </w:r>
-      <w:r>
-        <w:t>.</w:t>
-      </w:r>
-      <w:r>
-        <w:t xml:space="preserve"> Pois os conhecimentos adquiridos durante essa atividade foram expressivos. </w:t>
-      </w:r>
-    </w:p>
-    <w:p/>
-    <w:p>
-      <w:r>
-        <w:t xml:space="preserve">Espero </w:t>
-      </w:r>
-      <w:r>
-        <w:t>poder me ausentar de atividades por tempo considerável.</w:t>
-      </w:r>
-    </w:p>
-    <w:p/>
-    <w:p>
-      <w:r>
-        <w:t>Modelo de teste que eu utilizei foi o Copilot vê ai se tá certo.</w:t>
-      </w:r>
-    </w:p>
+        <w:t>OBS: não utilizei inteligência artificial para redigir este texto. Este qual, é 100% autoral e 100% feito somente com a minha própria capacidade argumentativa.</w:t>
+      </w:r>
+    </w:p>
+    <w:p>
+      <w:pPr>
+        <w:jc w:val="center"/>
+        <w:rPr>
+          <w:b/>
+          <w:bCs/>
+          <w:sz w:val="100"/>
+          <w:szCs w:val="100"/>
+        </w:rPr>
+      </w:pPr>
+      <w:r>
+        <w:rPr>
+          <w:b/>
+          <w:bCs/>
+          <w:sz w:val="100"/>
+          <w:szCs w:val="100"/>
+        </w:rPr>
+        <w:t>FIM</w:t>
+      </w:r>
+    </w:p>
+    <w:p/>
     <w:p/>
     <w:sectPr>
       <w:pgSz w:w="11906" w:h="16838"/>

</xml_diff>